<commit_message>
modify lab report 4 & 5
</commit_message>
<xml_diff>
--- a/Lab45_Report.docx
+++ b/Lab45_Report.docx
@@ -558,7 +558,21 @@
         <w:rPr>
           <w:rFonts w:ascii="Arial" w:hAnsi="Arial" w:cs="Arial"/>
         </w:rPr>
-        <w:t>Model Sudoku as a formal CSP with variables, domains, and constraints.</w:t>
+        <w:t xml:space="preserve">Model Sudoku </w:t>
+      </w:r>
+      <w:proofErr w:type="gramStart"/>
+      <w:r>
+        <w:rPr>
+          <w:rFonts w:ascii="Arial" w:hAnsi="Arial" w:cs="Arial"/>
+        </w:rPr>
+        <w:t>as</w:t>
+      </w:r>
+      <w:proofErr w:type="gramEnd"/>
+      <w:r>
+        <w:rPr>
+          <w:rFonts w:ascii="Arial" w:hAnsi="Arial" w:cs="Arial"/>
+        </w:rPr>
+        <w:t xml:space="preserve"> a formal CSP with variables, domains, and constraints.</w:t>
       </w:r>
     </w:p>
     <w:p>
@@ -728,7 +742,25 @@
           <w:sz w:val="23"/>
           <w:szCs w:val="23"/>
         </w:rPr>
-        <w:t>Variables = {A1, A2, ..., A9, B1, B2, ..., I9}   (|Variables| = 81)</w:t>
+        <w:t>Variables = {A1, A2, ..., A9, B1, B2, ..., I9}</w:t>
+      </w:r>
+      <w:proofErr w:type="gramStart"/>
+      <w:r>
+        <w:rPr>
+          <w:rFonts w:ascii="Consolas" w:hAnsi="Consolas" w:cs="Arial"/>
+          <w:sz w:val="23"/>
+          <w:szCs w:val="23"/>
+        </w:rPr>
+        <w:t xml:space="preserve">   (</w:t>
+      </w:r>
+      <w:proofErr w:type="gramEnd"/>
+      <w:r>
+        <w:rPr>
+          <w:rFonts w:ascii="Consolas" w:hAnsi="Consolas" w:cs="Arial"/>
+          <w:sz w:val="23"/>
+          <w:szCs w:val="23"/>
+        </w:rPr>
+        <w:t>|Variables| = 81)</w:t>
       </w:r>
     </w:p>
     <w:p>
@@ -743,7 +775,21 @@
         <w:rPr>
           <w:rFonts w:ascii="Arial" w:hAnsi="Arial" w:cs="Arial"/>
         </w:rPr>
-        <w:t>The variables are generated using the cross product utility:</w:t>
+        <w:t xml:space="preserve">The variables are generated using the </w:t>
+      </w:r>
+      <w:proofErr w:type="gramStart"/>
+      <w:r>
+        <w:rPr>
+          <w:rFonts w:ascii="Arial" w:hAnsi="Arial" w:cs="Arial"/>
+        </w:rPr>
+        <w:t>cross product</w:t>
+      </w:r>
+      <w:proofErr w:type="gramEnd"/>
+      <w:r>
+        <w:rPr>
+          <w:rFonts w:ascii="Arial" w:hAnsi="Arial" w:cs="Arial"/>
+        </w:rPr>
+        <w:t xml:space="preserve"> utility:</w:t>
       </w:r>
     </w:p>
     <w:p>
@@ -770,13 +816,6 @@
           <w:szCs w:val="23"/>
         </w:rPr>
         <w:br/>
-      </w:r>
-      <w:r>
-        <w:rPr>
-          <w:rFonts w:ascii="Consolas" w:hAnsi="Consolas" w:cs="Arial"/>
-          <w:sz w:val="23"/>
-          <w:szCs w:val="23"/>
-        </w:rPr>
         <w:t>cols = digits = "123456789"</w:t>
       </w:r>
       <w:r>
@@ -786,14 +825,43 @@
           <w:szCs w:val="23"/>
         </w:rPr>
         <w:br/>
-      </w:r>
-      <w:r>
-        <w:rPr>
-          <w:rFonts w:ascii="Consolas" w:hAnsi="Consolas" w:cs="Arial"/>
-          <w:sz w:val="23"/>
-          <w:szCs w:val="23"/>
-        </w:rPr>
-        <w:t>squares = cross(rows, cols)  # ['A1', 'A2', ..., 'I9']</w:t>
+        <w:t xml:space="preserve">squares = </w:t>
+      </w:r>
+      <w:proofErr w:type="gramStart"/>
+      <w:r>
+        <w:rPr>
+          <w:rFonts w:ascii="Consolas" w:hAnsi="Consolas" w:cs="Arial"/>
+          <w:sz w:val="23"/>
+          <w:szCs w:val="23"/>
+        </w:rPr>
+        <w:t>cross(</w:t>
+      </w:r>
+      <w:proofErr w:type="gramEnd"/>
+      <w:r>
+        <w:rPr>
+          <w:rFonts w:ascii="Consolas" w:hAnsi="Consolas" w:cs="Arial"/>
+          <w:sz w:val="23"/>
+          <w:szCs w:val="23"/>
+        </w:rPr>
+        <w:t xml:space="preserve">rows, </w:t>
+      </w:r>
+      <w:proofErr w:type="gramStart"/>
+      <w:r>
+        <w:rPr>
+          <w:rFonts w:ascii="Consolas" w:hAnsi="Consolas" w:cs="Arial"/>
+          <w:sz w:val="23"/>
+          <w:szCs w:val="23"/>
+        </w:rPr>
+        <w:t>cols)  #</w:t>
+      </w:r>
+      <w:proofErr w:type="gramEnd"/>
+      <w:r>
+        <w:rPr>
+          <w:rFonts w:ascii="Consolas" w:hAnsi="Consolas" w:cs="Arial"/>
+          <w:sz w:val="23"/>
+          <w:szCs w:val="23"/>
+        </w:rPr>
+        <w:t xml:space="preserve"> ['A1', 'A2', ..., 'I9']</w:t>
       </w:r>
     </w:p>
     <w:p>
@@ -831,8 +899,16 @@
         <w:rPr>
           <w:rFonts w:ascii="Arial" w:hAnsi="Arial" w:cs="Arial"/>
         </w:rPr>
-        <w:t>Each variable's domain is the set of digits it can take. For clue cells (given values), the domain is a singleton; for empty cells, the initial domain is {1, 2, 3, 4, 5, 6, 7, 8, 9}:</w:t>
-      </w:r>
+        <w:t xml:space="preserve">Each variable's domain is the set of digits it can take. For clue cells (given values), the domain is a singleton; for empty cells, the initial domain is {1, 2, 3, 4, 5, 6, 7, 8, </w:t>
+      </w:r>
+      <w:proofErr w:type="gramStart"/>
+      <w:r>
+        <w:rPr>
+          <w:rFonts w:ascii="Arial" w:hAnsi="Arial" w:cs="Arial"/>
+        </w:rPr>
+        <w:t>9}:</w:t>
+      </w:r>
+      <w:proofErr w:type="gramEnd"/>
     </w:p>
     <w:p>
       <w:pPr>
@@ -849,7 +925,25 @@
           <w:sz w:val="23"/>
           <w:szCs w:val="23"/>
         </w:rPr>
-        <w:t>def getDict(self, grid=""):</w:t>
+        <w:t xml:space="preserve">def </w:t>
+      </w:r>
+      <w:proofErr w:type="gramStart"/>
+      <w:r>
+        <w:rPr>
+          <w:rFonts w:ascii="Consolas" w:hAnsi="Consolas" w:cs="Arial"/>
+          <w:sz w:val="23"/>
+          <w:szCs w:val="23"/>
+        </w:rPr>
+        <w:t>getDict(</w:t>
+      </w:r>
+      <w:proofErr w:type="gramEnd"/>
+      <w:r>
+        <w:rPr>
+          <w:rFonts w:ascii="Consolas" w:hAnsi="Consolas" w:cs="Arial"/>
+          <w:sz w:val="23"/>
+          <w:szCs w:val="23"/>
+        </w:rPr>
+        <w:t>self, grid=""):</w:t>
       </w:r>
       <w:r>
         <w:rPr>
@@ -858,15 +952,25 @@
           <w:szCs w:val="23"/>
         </w:rPr>
         <w:br/>
-        <w:t xml:space="preserve">    </w:t>
-      </w:r>
-      <w:r>
-        <w:rPr>
-          <w:rFonts w:ascii="Consolas" w:hAnsi="Consolas" w:cs="Arial"/>
-          <w:sz w:val="23"/>
-          <w:szCs w:val="23"/>
-        </w:rPr>
-        <w:t>for cell in self.variables:</w:t>
+        <w:t xml:space="preserve">    for cell in </w:t>
+      </w:r>
+      <w:proofErr w:type="gramStart"/>
+      <w:r>
+        <w:rPr>
+          <w:rFonts w:ascii="Consolas" w:hAnsi="Consolas" w:cs="Arial"/>
+          <w:sz w:val="23"/>
+          <w:szCs w:val="23"/>
+        </w:rPr>
+        <w:t>self.variables</w:t>
+      </w:r>
+      <w:proofErr w:type="gramEnd"/>
+      <w:r>
+        <w:rPr>
+          <w:rFonts w:ascii="Consolas" w:hAnsi="Consolas" w:cs="Arial"/>
+          <w:sz w:val="23"/>
+          <w:szCs w:val="23"/>
+        </w:rPr>
+        <w:t>:</w:t>
       </w:r>
       <w:r>
         <w:rPr>
@@ -883,15 +987,25 @@
           <w:szCs w:val="23"/>
         </w:rPr>
         <w:lastRenderedPageBreak/>
-        <w:t xml:space="preserve">        </w:t>
-      </w:r>
-      <w:r>
-        <w:rPr>
-          <w:rFonts w:ascii="Consolas" w:hAnsi="Consolas" w:cs="Arial"/>
-          <w:sz w:val="23"/>
-          <w:szCs w:val="23"/>
-        </w:rPr>
-        <w:t>if grid[i] != '0':</w:t>
+        <w:t xml:space="preserve">        if grid[i</w:t>
+      </w:r>
+      <w:proofErr w:type="gramStart"/>
+      <w:r>
+        <w:rPr>
+          <w:rFonts w:ascii="Consolas" w:hAnsi="Consolas" w:cs="Arial"/>
+          <w:sz w:val="23"/>
+          <w:szCs w:val="23"/>
+        </w:rPr>
+        <w:t>] !</w:t>
+      </w:r>
+      <w:proofErr w:type="gramEnd"/>
+      <w:r>
+        <w:rPr>
+          <w:rFonts w:ascii="Consolas" w:hAnsi="Consolas" w:cs="Arial"/>
+          <w:sz w:val="23"/>
+          <w:szCs w:val="23"/>
+        </w:rPr>
+        <w:t>= '0':</w:t>
       </w:r>
       <w:r>
         <w:rPr>
@@ -900,15 +1014,25 @@
           <w:szCs w:val="23"/>
         </w:rPr>
         <w:br/>
-        <w:t xml:space="preserve">            </w:t>
-      </w:r>
-      <w:r>
-        <w:rPr>
-          <w:rFonts w:ascii="Consolas" w:hAnsi="Consolas" w:cs="Arial"/>
-          <w:sz w:val="23"/>
-          <w:szCs w:val="23"/>
-        </w:rPr>
-        <w:t>values[cell] = grid[i]      # singleton domain</w:t>
+        <w:t xml:space="preserve">            values[cell] = grid[</w:t>
+      </w:r>
+      <w:proofErr w:type="gramStart"/>
+      <w:r>
+        <w:rPr>
+          <w:rFonts w:ascii="Consolas" w:hAnsi="Consolas" w:cs="Arial"/>
+          <w:sz w:val="23"/>
+          <w:szCs w:val="23"/>
+        </w:rPr>
+        <w:t>i]      #</w:t>
+      </w:r>
+      <w:proofErr w:type="gramEnd"/>
+      <w:r>
+        <w:rPr>
+          <w:rFonts w:ascii="Consolas" w:hAnsi="Consolas" w:cs="Arial"/>
+          <w:sz w:val="23"/>
+          <w:szCs w:val="23"/>
+        </w:rPr>
+        <w:t xml:space="preserve"> singleton domain</w:t>
       </w:r>
       <w:r>
         <w:rPr>
@@ -917,15 +1041,7 @@
           <w:szCs w:val="23"/>
         </w:rPr>
         <w:br/>
-        <w:t xml:space="preserve">        </w:t>
-      </w:r>
-      <w:r>
-        <w:rPr>
-          <w:rFonts w:ascii="Consolas" w:hAnsi="Consolas" w:cs="Arial"/>
-          <w:sz w:val="23"/>
-          <w:szCs w:val="23"/>
-        </w:rPr>
-        <w:t>else:</w:t>
+        <w:t xml:space="preserve">        else:</w:t>
       </w:r>
       <w:r>
         <w:rPr>
@@ -934,15 +1050,7 @@
           <w:szCs w:val="23"/>
         </w:rPr>
         <w:br/>
-        <w:t xml:space="preserve">            </w:t>
-      </w:r>
-      <w:r>
-        <w:rPr>
-          <w:rFonts w:ascii="Consolas" w:hAnsi="Consolas" w:cs="Arial"/>
-          <w:sz w:val="23"/>
-          <w:szCs w:val="23"/>
-        </w:rPr>
-        <w:t>values[cell] = digits        # full domain "123456789"</w:t>
+        <w:t xml:space="preserve">            values[cell] = digits        # full domain "123456789"</w:t>
       </w:r>
     </w:p>
     <w:p>
@@ -1037,11 +1145,15 @@
               <w:jc w:val="center"/>
               <w:rPr>
                 <w:rFonts w:ascii="Arial" w:hAnsi="Arial" w:cs="Arial"/>
-              </w:rPr>
-            </w:pPr>
-            <w:r>
-              <w:rPr>
-                <w:rFonts w:ascii="Arial" w:hAnsi="Arial" w:cs="Arial"/>
+                <w:b/>
+                <w:bCs/>
+              </w:rPr>
+            </w:pPr>
+            <w:r>
+              <w:rPr>
+                <w:rFonts w:ascii="Arial" w:hAnsi="Arial" w:cs="Arial"/>
+                <w:b/>
+                <w:bCs/>
               </w:rPr>
               <w:t>Unit Type</w:t>
             </w:r>
@@ -1059,11 +1171,15 @@
               <w:jc w:val="center"/>
               <w:rPr>
                 <w:rFonts w:ascii="Arial" w:hAnsi="Arial" w:cs="Arial"/>
-              </w:rPr>
-            </w:pPr>
-            <w:r>
-              <w:rPr>
-                <w:rFonts w:ascii="Arial" w:hAnsi="Arial" w:cs="Arial"/>
+                <w:b/>
+                <w:bCs/>
+              </w:rPr>
+            </w:pPr>
+            <w:r>
+              <w:rPr>
+                <w:rFonts w:ascii="Arial" w:hAnsi="Arial" w:cs="Arial"/>
+                <w:b/>
+                <w:bCs/>
               </w:rPr>
               <w:t>Count</w:t>
             </w:r>
@@ -1081,11 +1197,15 @@
               <w:jc w:val="center"/>
               <w:rPr>
                 <w:rFonts w:ascii="Arial" w:hAnsi="Arial" w:cs="Arial"/>
-              </w:rPr>
-            </w:pPr>
-            <w:r>
-              <w:rPr>
-                <w:rFonts w:ascii="Arial" w:hAnsi="Arial" w:cs="Arial"/>
+                <w:b/>
+                <w:bCs/>
+              </w:rPr>
+            </w:pPr>
+            <w:r>
+              <w:rPr>
+                <w:rFonts w:ascii="Arial" w:hAnsi="Arial" w:cs="Arial"/>
+                <w:b/>
+                <w:bCs/>
               </w:rPr>
               <w:t>Description</w:t>
             </w:r>
@@ -1415,13 +1535,23 @@
           <w:szCs w:val="23"/>
         </w:rPr>
       </w:pPr>
-      <w:r>
-        <w:rPr>
-          <w:rFonts w:ascii="Consolas" w:hAnsi="Consolas" w:cs="Arial"/>
-          <w:sz w:val="23"/>
-          <w:szCs w:val="23"/>
-        </w:rPr>
-        <w:t>self.constraints = {(variable, peer)</w:t>
+      <w:proofErr w:type="gramStart"/>
+      <w:r>
+        <w:rPr>
+          <w:rFonts w:ascii="Consolas" w:hAnsi="Consolas" w:cs="Arial"/>
+          <w:sz w:val="23"/>
+          <w:szCs w:val="23"/>
+        </w:rPr>
+        <w:t>self.constraints</w:t>
+      </w:r>
+      <w:proofErr w:type="gramEnd"/>
+      <w:r>
+        <w:rPr>
+          <w:rFonts w:ascii="Consolas" w:hAnsi="Consolas" w:cs="Arial"/>
+          <w:sz w:val="23"/>
+          <w:szCs w:val="23"/>
+        </w:rPr>
+        <w:t xml:space="preserve"> = {(variable, peer)</w:t>
       </w:r>
       <w:r>
         <w:rPr>
@@ -1430,15 +1560,7 @@
           <w:szCs w:val="23"/>
         </w:rPr>
         <w:br/>
-        <w:t xml:space="preserve">                   </w:t>
-      </w:r>
-      <w:r>
-        <w:rPr>
-          <w:rFonts w:ascii="Consolas" w:hAnsi="Consolas" w:cs="Arial"/>
-          <w:sz w:val="23"/>
-          <w:szCs w:val="23"/>
-        </w:rPr>
-        <w:t>for variable in squares</w:t>
+        <w:t xml:space="preserve">                   for variable in squares</w:t>
       </w:r>
       <w:r>
         <w:rPr>
@@ -1447,15 +1569,25 @@
           <w:szCs w:val="23"/>
         </w:rPr>
         <w:br/>
-        <w:t xml:space="preserve">                   </w:t>
-      </w:r>
-      <w:r>
-        <w:rPr>
-          <w:rFonts w:ascii="Consolas" w:hAnsi="Consolas" w:cs="Arial"/>
-          <w:sz w:val="23"/>
-          <w:szCs w:val="23"/>
-        </w:rPr>
-        <w:t>for peer in self.peers[variable]}</w:t>
+        <w:t xml:space="preserve">                   for peer in </w:t>
+      </w:r>
+      <w:proofErr w:type="gramStart"/>
+      <w:r>
+        <w:rPr>
+          <w:rFonts w:ascii="Consolas" w:hAnsi="Consolas" w:cs="Arial"/>
+          <w:sz w:val="23"/>
+          <w:szCs w:val="23"/>
+        </w:rPr>
+        <w:t>self.peers</w:t>
+      </w:r>
+      <w:proofErr w:type="gramEnd"/>
+      <w:r>
+        <w:rPr>
+          <w:rFonts w:ascii="Consolas" w:hAnsi="Consolas" w:cs="Arial"/>
+          <w:sz w:val="23"/>
+          <w:szCs w:val="23"/>
+        </w:rPr>
+        <w:t>[variable]}</w:t>
       </w:r>
     </w:p>
     <w:p>
@@ -1901,7 +2033,21 @@
         <w:rPr>
           <w:rFonts w:ascii="Arial" w:hAnsi="Arial" w:cs="Arial"/>
         </w:rPr>
-        <w:t>The Revise function removes a value v from domain(xi) only when domain(xj) = {v} (i.e., xj is already assigned to v). This ensures no two peers can hold the same value.</w:t>
+        <w:t xml:space="preserve">The Revise function removes a value v from domain(xi) only when domain(xj) = {v} (i.e., xj is already assigned to v). This ensures </w:t>
+      </w:r>
+      <w:proofErr w:type="gramStart"/>
+      <w:r>
+        <w:rPr>
+          <w:rFonts w:ascii="Arial" w:hAnsi="Arial" w:cs="Arial"/>
+        </w:rPr>
+        <w:t>no</w:t>
+      </w:r>
+      <w:proofErr w:type="gramEnd"/>
+      <w:r>
+        <w:rPr>
+          <w:rFonts w:ascii="Arial" w:hAnsi="Arial" w:cs="Arial"/>
+        </w:rPr>
+        <w:t xml:space="preserve"> two peers can hold the same value.</w:t>
       </w:r>
     </w:p>
     <w:p>
@@ -1935,7 +2081,21 @@
         <w:rPr>
           <w:rFonts w:ascii="Arial" w:hAnsi="Arial" w:cs="Arial"/>
         </w:rPr>
-        <w:t>Time: O(n² · d³) where n = number of variables (81) and d = max domain size (9)</w:t>
+        <w:t xml:space="preserve">Time: </w:t>
+      </w:r>
+      <w:proofErr w:type="gramStart"/>
+      <w:r>
+        <w:rPr>
+          <w:rFonts w:ascii="Arial" w:hAnsi="Arial" w:cs="Arial"/>
+        </w:rPr>
+        <w:t>O(</w:t>
+      </w:r>
+      <w:proofErr w:type="gramEnd"/>
+      <w:r>
+        <w:rPr>
+          <w:rFonts w:ascii="Arial" w:hAnsi="Arial" w:cs="Arial"/>
+        </w:rPr>
+        <w:t>n² · d³) where n = number of variables (81) and d = max domain size (9)</w:t>
       </w:r>
     </w:p>
     <w:p>
@@ -2536,7 +2696,25 @@
           <w:sz w:val="23"/>
           <w:szCs w:val="23"/>
         </w:rPr>
-        <w:t>def Select_Unassigned_Variables(assignment, csp):</w:t>
+        <w:t>def Select_Unassigned_</w:t>
+      </w:r>
+      <w:proofErr w:type="gramStart"/>
+      <w:r>
+        <w:rPr>
+          <w:rFonts w:ascii="Consolas" w:hAnsi="Consolas" w:cs="Arial"/>
+          <w:sz w:val="23"/>
+          <w:szCs w:val="23"/>
+        </w:rPr>
+        <w:t>Variables(</w:t>
+      </w:r>
+      <w:proofErr w:type="gramEnd"/>
+      <w:r>
+        <w:rPr>
+          <w:rFonts w:ascii="Consolas" w:hAnsi="Consolas" w:cs="Arial"/>
+          <w:sz w:val="23"/>
+          <w:szCs w:val="23"/>
+        </w:rPr>
+        <w:t>assignment, csp):</w:t>
       </w:r>
       <w:r>
         <w:rPr>
@@ -2553,8 +2731,81 @@
           <w:sz w:val="23"/>
           <w:szCs w:val="23"/>
         </w:rPr>
-        <w:t>unassigned_variables = dict(</w:t>
-      </w:r>
+        <w:t xml:space="preserve">unassigned_variables = </w:t>
+      </w:r>
+      <w:proofErr w:type="gramStart"/>
+      <w:r>
+        <w:rPr>
+          <w:rFonts w:ascii="Consolas" w:hAnsi="Consolas" w:cs="Arial"/>
+          <w:sz w:val="23"/>
+          <w:szCs w:val="23"/>
+        </w:rPr>
+        <w:t>dict(</w:t>
+      </w:r>
+      <w:proofErr w:type="gramEnd"/>
+      <w:r>
+        <w:rPr>
+          <w:rFonts w:ascii="Consolas" w:hAnsi="Consolas" w:cs="Arial"/>
+          <w:sz w:val="23"/>
+          <w:szCs w:val="23"/>
+        </w:rPr>
+        <w:br/>
+        <w:t xml:space="preserve">     </w:t>
+      </w:r>
+      <w:proofErr w:type="gramStart"/>
+      <w:r>
+        <w:rPr>
+          <w:rFonts w:ascii="Consolas" w:hAnsi="Consolas" w:cs="Arial"/>
+          <w:sz w:val="23"/>
+          <w:szCs w:val="23"/>
+        </w:rPr>
+        <w:t xml:space="preserve">   </w:t>
+      </w:r>
+      <w:r>
+        <w:rPr>
+          <w:rFonts w:ascii="Consolas" w:hAnsi="Consolas" w:cs="Arial"/>
+          <w:sz w:val="23"/>
+          <w:szCs w:val="23"/>
+        </w:rPr>
+        <w:t>(</w:t>
+      </w:r>
+      <w:proofErr w:type="gramEnd"/>
+      <w:r>
+        <w:rPr>
+          <w:rFonts w:ascii="Consolas" w:hAnsi="Consolas" w:cs="Arial"/>
+          <w:sz w:val="23"/>
+          <w:szCs w:val="23"/>
+        </w:rPr>
+        <w:t>sq, len(</w:t>
+      </w:r>
+      <w:proofErr w:type="gramStart"/>
+      <w:r>
+        <w:rPr>
+          <w:rFonts w:ascii="Consolas" w:hAnsi="Consolas" w:cs="Arial"/>
+          <w:sz w:val="23"/>
+          <w:szCs w:val="23"/>
+        </w:rPr>
+        <w:t>csp.values</w:t>
+      </w:r>
+      <w:proofErr w:type="gramEnd"/>
+      <w:r>
+        <w:rPr>
+          <w:rFonts w:ascii="Consolas" w:hAnsi="Consolas" w:cs="Arial"/>
+          <w:sz w:val="23"/>
+          <w:szCs w:val="23"/>
+        </w:rPr>
+        <w:t xml:space="preserve">[sq])) for sq in </w:t>
+      </w:r>
+      <w:proofErr w:type="gramStart"/>
+      <w:r>
+        <w:rPr>
+          <w:rFonts w:ascii="Consolas" w:hAnsi="Consolas" w:cs="Arial"/>
+          <w:sz w:val="23"/>
+          <w:szCs w:val="23"/>
+        </w:rPr>
+        <w:t>csp.values</w:t>
+      </w:r>
+      <w:proofErr w:type="gramEnd"/>
       <w:r>
         <w:rPr>
           <w:rFonts w:ascii="Consolas" w:hAnsi="Consolas" w:cs="Arial"/>
@@ -2570,7 +2821,25 @@
           <w:sz w:val="23"/>
           <w:szCs w:val="23"/>
         </w:rPr>
-        <w:t>(sq, len(csp.values[sq])) for sq in csp.values</w:t>
+        <w:t xml:space="preserve">if sq not in </w:t>
+      </w:r>
+      <w:proofErr w:type="gramStart"/>
+      <w:r>
+        <w:rPr>
+          <w:rFonts w:ascii="Consolas" w:hAnsi="Consolas" w:cs="Arial"/>
+          <w:sz w:val="23"/>
+          <w:szCs w:val="23"/>
+        </w:rPr>
+        <w:t>assignment.keys</w:t>
+      </w:r>
+      <w:proofErr w:type="gramEnd"/>
+      <w:r>
+        <w:rPr>
+          <w:rFonts w:ascii="Consolas" w:hAnsi="Consolas" w:cs="Arial"/>
+          <w:sz w:val="23"/>
+          <w:szCs w:val="23"/>
+        </w:rPr>
+        <w:t>()</w:t>
       </w:r>
       <w:r>
         <w:rPr>
@@ -2579,16 +2848,26 @@
           <w:szCs w:val="23"/>
         </w:rPr>
         <w:br/>
-        <w:t xml:space="preserve">        </w:t>
-      </w:r>
-      <w:r>
-        <w:rPr>
-          <w:rFonts w:ascii="Consolas" w:hAnsi="Consolas" w:cs="Arial"/>
-          <w:sz w:val="23"/>
-          <w:szCs w:val="23"/>
-        </w:rPr>
-        <w:t>if sq not in assignment.keys()</w:t>
-      </w:r>
+        <w:t xml:space="preserve">  </w:t>
+      </w:r>
+      <w:proofErr w:type="gramStart"/>
+      <w:r>
+        <w:rPr>
+          <w:rFonts w:ascii="Consolas" w:hAnsi="Consolas" w:cs="Arial"/>
+          <w:sz w:val="23"/>
+          <w:szCs w:val="23"/>
+        </w:rPr>
+        <w:t xml:space="preserve">  </w:t>
+      </w:r>
+      <w:r>
+        <w:rPr>
+          <w:rFonts w:ascii="Consolas" w:hAnsi="Consolas" w:cs="Arial"/>
+          <w:sz w:val="23"/>
+          <w:szCs w:val="23"/>
+        </w:rPr>
+        <w:t>)</w:t>
+      </w:r>
+      <w:proofErr w:type="gramEnd"/>
       <w:r>
         <w:rPr>
           <w:rFonts w:ascii="Consolas" w:hAnsi="Consolas" w:cs="Arial"/>
@@ -2604,24 +2883,25 @@
           <w:sz w:val="23"/>
           <w:szCs w:val="23"/>
         </w:rPr>
-        <w:t>)</w:t>
-      </w:r>
-      <w:r>
-        <w:rPr>
-          <w:rFonts w:ascii="Consolas" w:hAnsi="Consolas" w:cs="Arial"/>
-          <w:sz w:val="23"/>
-          <w:szCs w:val="23"/>
-        </w:rPr>
-        <w:br/>
-        <w:t xml:space="preserve">    </w:t>
-      </w:r>
-      <w:r>
-        <w:rPr>
-          <w:rFonts w:ascii="Consolas" w:hAnsi="Consolas" w:cs="Arial"/>
-          <w:sz w:val="23"/>
-          <w:szCs w:val="23"/>
-        </w:rPr>
-        <w:t>mrv = min(unassigned_variables, key=unassigned_variables.get)</w:t>
+        <w:t xml:space="preserve">mrv = </w:t>
+      </w:r>
+      <w:proofErr w:type="gramStart"/>
+      <w:r>
+        <w:rPr>
+          <w:rFonts w:ascii="Consolas" w:hAnsi="Consolas" w:cs="Arial"/>
+          <w:sz w:val="23"/>
+          <w:szCs w:val="23"/>
+        </w:rPr>
+        <w:t>min(</w:t>
+      </w:r>
+      <w:proofErr w:type="gramEnd"/>
+      <w:r>
+        <w:rPr>
+          <w:rFonts w:ascii="Consolas" w:hAnsi="Consolas" w:cs="Arial"/>
+          <w:sz w:val="23"/>
+          <w:szCs w:val="23"/>
+        </w:rPr>
+        <w:t>unassigned_variables, key=unassigned_variables.get)</w:t>
       </w:r>
       <w:r>
         <w:rPr>
@@ -2749,40 +3029,13 @@
         </w:rPr>
         <w:t>for neighbor in csp.peers[var]:</w:t>
       </w:r>
-    </w:p>
-    <w:p>
-      <w:pPr>
-        <w:rPr>
-          <w:rFonts w:ascii="Consolas" w:hAnsi="Consolas" w:cs="Arial"/>
-          <w:sz w:val="23"/>
-          <w:szCs w:val="23"/>
-        </w:rPr>
-      </w:pPr>
-      <w:r>
-        <w:rPr>
-          <w:rFonts w:ascii="Consolas" w:hAnsi="Consolas" w:cs="Arial"/>
-          <w:sz w:val="23"/>
-          <w:szCs w:val="23"/>
-        </w:rPr>
-        <w:br w:type="page"/>
-      </w:r>
-    </w:p>
-    <w:p>
-      <w:pPr>
-        <w:ind w:left="1843"/>
-        <w:rPr>
-          <w:rFonts w:ascii="Consolas" w:hAnsi="Consolas" w:cs="Arial"/>
-          <w:sz w:val="23"/>
-          <w:szCs w:val="23"/>
-        </w:rPr>
-      </w:pPr>
-      <w:r>
-        <w:rPr>
-          <w:rFonts w:ascii="Consolas" w:hAnsi="Consolas" w:cs="Arial"/>
-          <w:sz w:val="23"/>
-          <w:szCs w:val="23"/>
-        </w:rPr>
-        <w:lastRenderedPageBreak/>
+      <w:r>
+        <w:rPr>
+          <w:rFonts w:ascii="Consolas" w:hAnsi="Consolas" w:cs="Arial"/>
+          <w:sz w:val="23"/>
+          <w:szCs w:val="23"/>
+        </w:rPr>
+        <w:br/>
         <w:t xml:space="preserve">        </w:t>
       </w:r>
       <w:r>
@@ -2917,6 +3170,14 @@
           <w:szCs w:val="23"/>
         </w:rPr>
         <w:br/>
+      </w:r>
+      <w:r>
+        <w:rPr>
+          <w:rFonts w:ascii="Consolas" w:hAnsi="Consolas" w:cs="Arial"/>
+          <w:sz w:val="23"/>
+          <w:szCs w:val="23"/>
+        </w:rPr>
+        <w:lastRenderedPageBreak/>
         <w:t xml:space="preserve">                </w:t>
       </w:r>
       <w:r>
@@ -2995,7 +3256,21 @@
         <w:rPr>
           <w:rFonts w:ascii="Arial" w:hAnsi="Arial" w:cs="Arial"/>
         </w:rPr>
-        <w:t>Detects failures early when a peer's domain would become empty.</w:t>
+        <w:t xml:space="preserve">Detects failures early when a peer's domain </w:t>
+      </w:r>
+      <w:proofErr w:type="gramStart"/>
+      <w:r>
+        <w:rPr>
+          <w:rFonts w:ascii="Arial" w:hAnsi="Arial" w:cs="Arial"/>
+        </w:rPr>
+        <w:t>would become</w:t>
+      </w:r>
+      <w:proofErr w:type="gramEnd"/>
+      <w:r>
+        <w:rPr>
+          <w:rFonts w:ascii="Arial" w:hAnsi="Arial" w:cs="Arial"/>
+        </w:rPr>
+        <w:t xml:space="preserve"> empty.</w:t>
       </w:r>
     </w:p>
     <w:p>
@@ -3013,7 +3288,21 @@
         <w:rPr>
           <w:rFonts w:ascii="Arial" w:hAnsi="Arial" w:cs="Arial"/>
         </w:rPr>
-        <w:t>Performs recursive propagation: when a domain is reduced to a single value, that value is further propagated to its peers (creating a chain reaction effect similar to constraint propagation).</w:t>
+        <w:t xml:space="preserve">Performs recursive propagation: when a domain is reduced to a single value, that value is further propagated to its peers (creating a chain reaction effect </w:t>
+      </w:r>
+      <w:proofErr w:type="gramStart"/>
+      <w:r>
+        <w:rPr>
+          <w:rFonts w:ascii="Arial" w:hAnsi="Arial" w:cs="Arial"/>
+        </w:rPr>
+        <w:t>similar to</w:t>
+      </w:r>
+      <w:proofErr w:type="gramEnd"/>
+      <w:r>
+        <w:rPr>
+          <w:rFonts w:ascii="Arial" w:hAnsi="Arial" w:cs="Arial"/>
+        </w:rPr>
+        <w:t xml:space="preserve"> constraint propagation).</w:t>
       </w:r>
     </w:p>
     <w:p>
@@ -3077,7 +3366,25 @@
           <w:sz w:val="23"/>
           <w:szCs w:val="23"/>
         </w:rPr>
-        <w:t>saved_values = deepcopy(csp.values)</w:t>
+        <w:t>saved_values = deepcopy(</w:t>
+      </w:r>
+      <w:proofErr w:type="gramStart"/>
+      <w:r>
+        <w:rPr>
+          <w:rFonts w:ascii="Consolas" w:hAnsi="Consolas" w:cs="Arial"/>
+          <w:sz w:val="23"/>
+          <w:szCs w:val="23"/>
+        </w:rPr>
+        <w:t>csp.values</w:t>
+      </w:r>
+      <w:proofErr w:type="gramEnd"/>
+      <w:r>
+        <w:rPr>
+          <w:rFonts w:ascii="Consolas" w:hAnsi="Consolas" w:cs="Arial"/>
+          <w:sz w:val="23"/>
+          <w:szCs w:val="23"/>
+        </w:rPr>
+        <w:t>)</w:t>
       </w:r>
       <w:r>
         <w:rPr>
@@ -3135,13 +3442,41 @@
         </w:rPr>
         <w:br/>
       </w:r>
-      <w:r>
-        <w:rPr>
-          <w:rFonts w:ascii="Consolas" w:hAnsi="Consolas" w:cs="Arial"/>
-          <w:sz w:val="23"/>
-          <w:szCs w:val="23"/>
-        </w:rPr>
-        <w:t>csp.values = saved_values  # restore all domains</w:t>
+      <w:proofErr w:type="gramStart"/>
+      <w:r>
+        <w:rPr>
+          <w:rFonts w:ascii="Consolas" w:hAnsi="Consolas" w:cs="Arial"/>
+          <w:sz w:val="23"/>
+          <w:szCs w:val="23"/>
+        </w:rPr>
+        <w:t>csp.values</w:t>
+      </w:r>
+      <w:proofErr w:type="gramEnd"/>
+      <w:r>
+        <w:rPr>
+          <w:rFonts w:ascii="Consolas" w:hAnsi="Consolas" w:cs="Arial"/>
+          <w:sz w:val="23"/>
+          <w:szCs w:val="23"/>
+        </w:rPr>
+        <w:t xml:space="preserve"> = saved_</w:t>
+      </w:r>
+      <w:proofErr w:type="gramStart"/>
+      <w:r>
+        <w:rPr>
+          <w:rFonts w:ascii="Consolas" w:hAnsi="Consolas" w:cs="Arial"/>
+          <w:sz w:val="23"/>
+          <w:szCs w:val="23"/>
+        </w:rPr>
+        <w:t>values  #</w:t>
+      </w:r>
+      <w:proofErr w:type="gramEnd"/>
+      <w:r>
+        <w:rPr>
+          <w:rFonts w:ascii="Consolas" w:hAnsi="Consolas" w:cs="Arial"/>
+          <w:sz w:val="23"/>
+          <w:szCs w:val="23"/>
+        </w:rPr>
+        <w:t xml:space="preserve"> restore all domains</w:t>
       </w:r>
     </w:p>
     <w:p>
@@ -3303,7 +3638,6 @@
           <w:rFonts w:ascii="Arial" w:hAnsi="Arial" w:cs="Arial"/>
           <w:szCs w:val="24"/>
         </w:rPr>
-        <w:lastRenderedPageBreak/>
         <w:t>Batch Mode: "Solve All" button to solve all puzzles in a file and export results.</w:t>
       </w:r>
     </w:p>
@@ -3324,8 +3658,64 @@
           <w:rFonts w:ascii="Arial" w:hAnsi="Arial" w:cs="Arial"/>
           <w:szCs w:val="24"/>
         </w:rPr>
-        <w:t>Metrics Panel: Real-time display of time elapsed, nodes explored, guesses made, and backtracks.</w:t>
-      </w:r>
+        <w:t xml:space="preserve">Metrics Panel: Real-time display of time elapsed, nodes explored, guesses </w:t>
+      </w:r>
+      <w:proofErr w:type="gramStart"/>
+      <w:r>
+        <w:rPr>
+          <w:rFonts w:ascii="Arial" w:hAnsi="Arial" w:cs="Arial"/>
+          <w:szCs w:val="24"/>
+        </w:rPr>
+        <w:t>made, and</w:t>
+      </w:r>
+      <w:proofErr w:type="gramEnd"/>
+      <w:r>
+        <w:rPr>
+          <w:rFonts w:ascii="Arial" w:hAnsi="Arial" w:cs="Arial"/>
+          <w:szCs w:val="24"/>
+        </w:rPr>
+        <w:t xml:space="preserve"> backtracks.</w:t>
+      </w:r>
+    </w:p>
+    <w:p>
+      <w:pPr>
+        <w:pStyle w:val="ListParagraph"/>
+        <w:ind w:left="1440"/>
+        <w:rPr>
+          <w:rFonts w:ascii="Arial" w:hAnsi="Arial" w:cs="Arial"/>
+          <w:szCs w:val="24"/>
+        </w:rPr>
+      </w:pPr>
+    </w:p>
+    <w:p>
+      <w:pPr>
+        <w:pStyle w:val="ListParagraph"/>
+        <w:ind w:left="1440"/>
+        <w:rPr>
+          <w:rFonts w:ascii="Arial" w:hAnsi="Arial" w:cs="Arial"/>
+          <w:szCs w:val="24"/>
+        </w:rPr>
+      </w:pPr>
+    </w:p>
+    <w:p>
+      <w:pPr>
+        <w:pStyle w:val="ListParagraph"/>
+        <w:ind w:left="1440"/>
+        <w:rPr>
+          <w:rFonts w:ascii="Arial" w:hAnsi="Arial" w:cs="Arial"/>
+          <w:szCs w:val="24"/>
+        </w:rPr>
+      </w:pPr>
+    </w:p>
+    <w:p>
+      <w:pPr>
+        <w:pStyle w:val="ListParagraph"/>
+        <w:ind w:left="1440"/>
+        <w:rPr>
+          <w:rFonts w:ascii="Arial" w:hAnsi="Arial" w:cs="Arial"/>
+          <w:szCs w:val="24"/>
+        </w:rPr>
+      </w:pPr>
     </w:p>
     <w:p>
       <w:pPr>
@@ -3360,6 +3750,7 @@
           <w:sz w:val="28"/>
           <w:szCs w:val="28"/>
         </w:rPr>
+        <w:lastRenderedPageBreak/>
         <w:t>Experimental Results</w:t>
       </w:r>
     </w:p>
@@ -3407,8 +3798,8 @@
         <w:tblLook w:val="04A0" w:firstRow="1" w:lastRow="0" w:firstColumn="1" w:lastColumn="0" w:noHBand="0" w:noVBand="1"/>
       </w:tblPr>
       <w:tblGrid>
-        <w:gridCol w:w="1895"/>
-        <w:gridCol w:w="1897"/>
+        <w:gridCol w:w="1894"/>
+        <w:gridCol w:w="1898"/>
         <w:gridCol w:w="1854"/>
         <w:gridCol w:w="1854"/>
         <w:gridCol w:w="1854"/>
@@ -3428,12 +3819,16 @@
               <w:ind w:left="0"/>
               <w:rPr>
                 <w:rFonts w:ascii="Arial" w:hAnsi="Arial" w:cs="Arial"/>
-                <w:szCs w:val="24"/>
-              </w:rPr>
-            </w:pPr>
-            <w:r>
-              <w:rPr>
-                <w:rFonts w:ascii="Arial" w:hAnsi="Arial" w:cs="Arial"/>
+                <w:b/>
+                <w:bCs/>
+                <w:szCs w:val="24"/>
+              </w:rPr>
+            </w:pPr>
+            <w:r>
+              <w:rPr>
+                <w:rFonts w:ascii="Arial" w:hAnsi="Arial" w:cs="Arial"/>
+                <w:b/>
+                <w:bCs/>
                 <w:szCs w:val="24"/>
               </w:rPr>
               <w:t>Dataset</w:t>
@@ -3451,12 +3846,16 @@
               <w:ind w:left="0"/>
               <w:rPr>
                 <w:rFonts w:ascii="Arial" w:hAnsi="Arial" w:cs="Arial"/>
-                <w:szCs w:val="24"/>
-              </w:rPr>
-            </w:pPr>
-            <w:r>
-              <w:rPr>
-                <w:rFonts w:ascii="Arial" w:hAnsi="Arial" w:cs="Arial"/>
+                <w:b/>
+                <w:bCs/>
+                <w:szCs w:val="24"/>
+              </w:rPr>
+            </w:pPr>
+            <w:r>
+              <w:rPr>
+                <w:rFonts w:ascii="Arial" w:hAnsi="Arial" w:cs="Arial"/>
+                <w:b/>
+                <w:bCs/>
                 <w:szCs w:val="24"/>
               </w:rPr>
               <w:t>Puzzles</w:t>
@@ -3474,12 +3873,16 @@
               <w:ind w:left="0"/>
               <w:rPr>
                 <w:rFonts w:ascii="Arial" w:hAnsi="Arial" w:cs="Arial"/>
-                <w:szCs w:val="24"/>
-              </w:rPr>
-            </w:pPr>
-            <w:r>
-              <w:rPr>
-                <w:rFonts w:ascii="Arial" w:hAnsi="Arial" w:cs="Arial"/>
+                <w:b/>
+                <w:bCs/>
+                <w:szCs w:val="24"/>
+              </w:rPr>
+            </w:pPr>
+            <w:r>
+              <w:rPr>
+                <w:rFonts w:ascii="Arial" w:hAnsi="Arial" w:cs="Arial"/>
+                <w:b/>
+                <w:bCs/>
                 <w:szCs w:val="24"/>
               </w:rPr>
               <w:t>Avg Clues</w:t>
@@ -3497,12 +3900,16 @@
               <w:ind w:left="0"/>
               <w:rPr>
                 <w:rFonts w:ascii="Arial" w:hAnsi="Arial" w:cs="Arial"/>
-                <w:szCs w:val="24"/>
-              </w:rPr>
-            </w:pPr>
-            <w:r>
-              <w:rPr>
-                <w:rFonts w:ascii="Arial" w:hAnsi="Arial" w:cs="Arial"/>
+                <w:b/>
+                <w:bCs/>
+                <w:szCs w:val="24"/>
+              </w:rPr>
+            </w:pPr>
+            <w:r>
+              <w:rPr>
+                <w:rFonts w:ascii="Arial" w:hAnsi="Arial" w:cs="Arial"/>
+                <w:b/>
+                <w:bCs/>
                 <w:szCs w:val="24"/>
               </w:rPr>
               <w:t>Min Clues</w:t>
@@ -3520,12 +3927,16 @@
               <w:ind w:left="0"/>
               <w:rPr>
                 <w:rFonts w:ascii="Arial" w:hAnsi="Arial" w:cs="Arial"/>
-                <w:szCs w:val="24"/>
-              </w:rPr>
-            </w:pPr>
-            <w:r>
-              <w:rPr>
-                <w:rFonts w:ascii="Arial" w:hAnsi="Arial" w:cs="Arial"/>
+                <w:b/>
+                <w:bCs/>
+                <w:szCs w:val="24"/>
+              </w:rPr>
+            </w:pPr>
+            <w:r>
+              <w:rPr>
+                <w:rFonts w:ascii="Arial" w:hAnsi="Arial" w:cs="Arial"/>
+                <w:b/>
+                <w:bCs/>
                 <w:szCs w:val="24"/>
               </w:rPr>
               <w:t>Max Clues</w:t>
@@ -3935,12 +4346,16 @@
               <w:jc w:val="center"/>
               <w:rPr>
                 <w:rFonts w:ascii="Arial" w:hAnsi="Arial" w:cs="Arial"/>
-                <w:szCs w:val="24"/>
-              </w:rPr>
-            </w:pPr>
-            <w:r>
-              <w:rPr>
-                <w:rFonts w:ascii="Arial" w:hAnsi="Arial" w:cs="Arial"/>
+                <w:b/>
+                <w:bCs/>
+                <w:szCs w:val="24"/>
+              </w:rPr>
+            </w:pPr>
+            <w:r>
+              <w:rPr>
+                <w:rFonts w:ascii="Arial" w:hAnsi="Arial" w:cs="Arial"/>
+                <w:b/>
+                <w:bCs/>
                 <w:szCs w:val="24"/>
               </w:rPr>
               <w:t>Metric</w:t>
@@ -3959,12 +4374,16 @@
               <w:jc w:val="center"/>
               <w:rPr>
                 <w:rFonts w:ascii="Arial" w:hAnsi="Arial" w:cs="Arial"/>
-                <w:szCs w:val="24"/>
-              </w:rPr>
-            </w:pPr>
-            <w:r>
-              <w:rPr>
-                <w:rFonts w:ascii="Arial" w:hAnsi="Arial" w:cs="Arial"/>
+                <w:b/>
+                <w:bCs/>
+                <w:szCs w:val="24"/>
+              </w:rPr>
+            </w:pPr>
+            <w:r>
+              <w:rPr>
+                <w:rFonts w:ascii="Arial" w:hAnsi="Arial" w:cs="Arial"/>
+                <w:b/>
+                <w:bCs/>
                 <w:szCs w:val="24"/>
               </w:rPr>
               <w:t>Euler</w:t>
@@ -3983,12 +4402,16 @@
               <w:jc w:val="center"/>
               <w:rPr>
                 <w:rFonts w:ascii="Arial" w:hAnsi="Arial" w:cs="Arial"/>
-                <w:szCs w:val="24"/>
-              </w:rPr>
-            </w:pPr>
-            <w:r>
-              <w:rPr>
-                <w:rFonts w:ascii="Arial" w:hAnsi="Arial" w:cs="Arial"/>
+                <w:b/>
+                <w:bCs/>
+                <w:szCs w:val="24"/>
+              </w:rPr>
+            </w:pPr>
+            <w:r>
+              <w:rPr>
+                <w:rFonts w:ascii="Arial" w:hAnsi="Arial" w:cs="Arial"/>
+                <w:b/>
+                <w:bCs/>
                 <w:szCs w:val="24"/>
               </w:rPr>
               <w:t>Magic Tour</w:t>
@@ -4603,9 +5026,9 @@
         <w:tblLook w:val="04A0" w:firstRow="1" w:lastRow="0" w:firstColumn="1" w:lastColumn="0" w:noHBand="0" w:noVBand="1"/>
       </w:tblPr>
       <w:tblGrid>
-        <w:gridCol w:w="2890"/>
-        <w:gridCol w:w="2871"/>
-        <w:gridCol w:w="2918"/>
+        <w:gridCol w:w="2892"/>
+        <w:gridCol w:w="2870"/>
+        <w:gridCol w:w="2917"/>
       </w:tblGrid>
       <w:tr>
         <w:trPr>
@@ -4622,12 +5045,16 @@
               <w:ind w:left="0"/>
               <w:rPr>
                 <w:rFonts w:ascii="Arial" w:hAnsi="Arial" w:cs="Arial"/>
-                <w:szCs w:val="24"/>
-              </w:rPr>
-            </w:pPr>
-            <w:r>
-              <w:rPr>
-                <w:rFonts w:ascii="Arial" w:hAnsi="Arial" w:cs="Arial"/>
+                <w:b/>
+                <w:bCs/>
+                <w:szCs w:val="24"/>
+              </w:rPr>
+            </w:pPr>
+            <w:r>
+              <w:rPr>
+                <w:rFonts w:ascii="Arial" w:hAnsi="Arial" w:cs="Arial"/>
+                <w:b/>
+                <w:bCs/>
                 <w:szCs w:val="24"/>
               </w:rPr>
               <w:t>Time Range</w:t>
@@ -4645,12 +5072,16 @@
               <w:ind w:left="0"/>
               <w:rPr>
                 <w:rFonts w:ascii="Arial" w:hAnsi="Arial" w:cs="Arial"/>
-                <w:szCs w:val="24"/>
-              </w:rPr>
-            </w:pPr>
-            <w:r>
-              <w:rPr>
-                <w:rFonts w:ascii="Arial" w:hAnsi="Arial" w:cs="Arial"/>
+                <w:b/>
+                <w:bCs/>
+                <w:szCs w:val="24"/>
+              </w:rPr>
+            </w:pPr>
+            <w:r>
+              <w:rPr>
+                <w:rFonts w:ascii="Arial" w:hAnsi="Arial" w:cs="Arial"/>
+                <w:b/>
+                <w:bCs/>
                 <w:szCs w:val="24"/>
               </w:rPr>
               <w:t>Euler</w:t>
@@ -4668,12 +5099,16 @@
               <w:ind w:left="0"/>
               <w:rPr>
                 <w:rFonts w:ascii="Arial" w:hAnsi="Arial" w:cs="Arial"/>
-                <w:szCs w:val="24"/>
-              </w:rPr>
-            </w:pPr>
-            <w:r>
-              <w:rPr>
-                <w:rFonts w:ascii="Arial" w:hAnsi="Arial" w:cs="Arial"/>
+                <w:b/>
+                <w:bCs/>
+                <w:szCs w:val="24"/>
+              </w:rPr>
+            </w:pPr>
+            <w:r>
+              <w:rPr>
+                <w:rFonts w:ascii="Arial" w:hAnsi="Arial" w:cs="Arial"/>
+                <w:b/>
+                <w:bCs/>
                 <w:szCs w:val="24"/>
               </w:rPr>
               <w:t>Magic Tour</w:t>
@@ -4778,7 +5213,6 @@
                 <w:rFonts w:ascii="Arial" w:hAnsi="Arial" w:cs="Arial"/>
                 <w:szCs w:val="24"/>
               </w:rPr>
-              <w:lastRenderedPageBreak/>
               <w:t>50 – 500ms</w:t>
             </w:r>
           </w:p>
@@ -5014,6 +5448,7 @@
           <w:sz w:val="28"/>
           <w:szCs w:val="28"/>
         </w:rPr>
+        <w:lastRenderedPageBreak/>
         <w:t>Analysis and Discussion</w:t>
       </w:r>
     </w:p>
@@ -5099,12 +5534,16 @@
               <w:jc w:val="center"/>
               <w:rPr>
                 <w:rFonts w:ascii="Arial" w:hAnsi="Arial" w:cs="Arial"/>
-                <w:szCs w:val="24"/>
-              </w:rPr>
-            </w:pPr>
-            <w:r>
-              <w:rPr>
-                <w:rFonts w:ascii="Arial" w:hAnsi="Arial" w:cs="Arial"/>
+                <w:b/>
+                <w:bCs/>
+                <w:szCs w:val="24"/>
+              </w:rPr>
+            </w:pPr>
+            <w:r>
+              <w:rPr>
+                <w:rFonts w:ascii="Arial" w:hAnsi="Arial" w:cs="Arial"/>
+                <w:b/>
+                <w:bCs/>
                 <w:szCs w:val="24"/>
               </w:rPr>
               <w:t>Clue Count</w:t>
@@ -5123,12 +5562,16 @@
               <w:jc w:val="center"/>
               <w:rPr>
                 <w:rFonts w:ascii="Arial" w:hAnsi="Arial" w:cs="Arial"/>
-                <w:szCs w:val="24"/>
-              </w:rPr>
-            </w:pPr>
-            <w:r>
-              <w:rPr>
-                <w:rFonts w:ascii="Arial" w:hAnsi="Arial" w:cs="Arial"/>
+                <w:b/>
+                <w:bCs/>
+                <w:szCs w:val="24"/>
+              </w:rPr>
+            </w:pPr>
+            <w:r>
+              <w:rPr>
+                <w:rFonts w:ascii="Arial" w:hAnsi="Arial" w:cs="Arial"/>
+                <w:b/>
+                <w:bCs/>
                 <w:szCs w:val="24"/>
               </w:rPr>
               <w:t>Euler Average Time</w:t>
@@ -5147,12 +5590,16 @@
               <w:jc w:val="center"/>
               <w:rPr>
                 <w:rFonts w:ascii="Arial" w:hAnsi="Arial" w:cs="Arial"/>
-                <w:szCs w:val="24"/>
-              </w:rPr>
-            </w:pPr>
-            <w:r>
-              <w:rPr>
-                <w:rFonts w:ascii="Arial" w:hAnsi="Arial" w:cs="Arial"/>
+                <w:b/>
+                <w:bCs/>
+                <w:szCs w:val="24"/>
+              </w:rPr>
+            </w:pPr>
+            <w:r>
+              <w:rPr>
+                <w:rFonts w:ascii="Arial" w:hAnsi="Arial" w:cs="Arial"/>
+                <w:b/>
+                <w:bCs/>
                 <w:szCs w:val="24"/>
               </w:rPr>
               <w:t>Magic Tour Average Time</w:t>
@@ -5835,7 +6282,6 @@
           <w:rFonts w:ascii="Arial" w:hAnsi="Arial" w:cs="Arial"/>
           <w:szCs w:val="24"/>
         </w:rPr>
-        <w:lastRenderedPageBreak/>
         <w:t>The MRV (Minimum Remaining Values) heuristic is critical for performance. By always selecting the variable with the fewest remaining domain values:</w:t>
       </w:r>
     </w:p>
@@ -5899,6 +6345,7 @@
           <w:rFonts w:ascii="Arial" w:hAnsi="Arial" w:cs="Arial"/>
           <w:szCs w:val="24"/>
         </w:rPr>
+        <w:lastRenderedPageBreak/>
         <w:t>Without MRV (e.g., using a fixed ordering), the hardest Magic Tour puzzles could take orders of magnitude longer.</w:t>
       </w:r>
     </w:p>
@@ -6016,7 +6463,23 @@
           <w:rFonts w:ascii="Arial" w:hAnsi="Arial" w:cs="Arial"/>
           <w:szCs w:val="24"/>
         </w:rPr>
-        <w:t>This creates a cascade effect similar to running AC-3 locally after each assignment.</w:t>
+        <w:t xml:space="preserve">This creates a cascade effect </w:t>
+      </w:r>
+      <w:proofErr w:type="gramStart"/>
+      <w:r>
+        <w:rPr>
+          <w:rFonts w:ascii="Arial" w:hAnsi="Arial" w:cs="Arial"/>
+          <w:szCs w:val="24"/>
+        </w:rPr>
+        <w:t>similar to</w:t>
+      </w:r>
+      <w:proofErr w:type="gramEnd"/>
+      <w:r>
+        <w:rPr>
+          <w:rFonts w:ascii="Arial" w:hAnsi="Arial" w:cs="Arial"/>
+          <w:szCs w:val="24"/>
+        </w:rPr>
+        <w:t xml:space="preserve"> running AC-3 locally after each assignment.</w:t>
       </w:r>
     </w:p>
     <w:p>
@@ -6114,12 +6577,16 @@
               <w:jc w:val="center"/>
               <w:rPr>
                 <w:rFonts w:ascii="Arial" w:hAnsi="Arial" w:cs="Arial"/>
-                <w:szCs w:val="24"/>
-              </w:rPr>
-            </w:pPr>
-            <w:r>
-              <w:rPr>
-                <w:rFonts w:ascii="Arial" w:hAnsi="Arial" w:cs="Arial"/>
+                <w:b/>
+                <w:bCs/>
+                <w:szCs w:val="24"/>
+              </w:rPr>
+            </w:pPr>
+            <w:r>
+              <w:rPr>
+                <w:rFonts w:ascii="Arial" w:hAnsi="Arial" w:cs="Arial"/>
+                <w:b/>
+                <w:bCs/>
                 <w:szCs w:val="24"/>
               </w:rPr>
               <w:t>Aspect</w:t>
@@ -6138,12 +6605,16 @@
               <w:jc w:val="center"/>
               <w:rPr>
                 <w:rFonts w:ascii="Arial" w:hAnsi="Arial" w:cs="Arial"/>
-                <w:szCs w:val="24"/>
-              </w:rPr>
-            </w:pPr>
-            <w:r>
-              <w:rPr>
-                <w:rFonts w:ascii="Arial" w:hAnsi="Arial" w:cs="Arial"/>
+                <w:b/>
+                <w:bCs/>
+                <w:szCs w:val="24"/>
+              </w:rPr>
+            </w:pPr>
+            <w:r>
+              <w:rPr>
+                <w:rFonts w:ascii="Arial" w:hAnsi="Arial" w:cs="Arial"/>
+                <w:b/>
+                <w:bCs/>
                 <w:szCs w:val="24"/>
               </w:rPr>
               <w:t>Euler</w:t>
@@ -6162,12 +6633,16 @@
               <w:jc w:val="center"/>
               <w:rPr>
                 <w:rFonts w:ascii="Arial" w:hAnsi="Arial" w:cs="Arial"/>
-                <w:szCs w:val="24"/>
-              </w:rPr>
-            </w:pPr>
-            <w:r>
-              <w:rPr>
-                <w:rFonts w:ascii="Arial" w:hAnsi="Arial" w:cs="Arial"/>
+                <w:b/>
+                <w:bCs/>
+                <w:szCs w:val="24"/>
+              </w:rPr>
+            </w:pPr>
+            <w:r>
+              <w:rPr>
+                <w:rFonts w:ascii="Arial" w:hAnsi="Arial" w:cs="Arial"/>
+                <w:b/>
+                <w:bCs/>
                 <w:szCs w:val="24"/>
               </w:rPr>
               <w:t>Magic Tour</w:t>
@@ -6760,7 +7235,6 @@
           <w:rFonts w:ascii="Arial" w:hAnsi="Arial" w:cs="Arial"/>
           <w:szCs w:val="24"/>
         </w:rPr>
-        <w:lastRenderedPageBreak/>
         <w:t>The combined AC-3 + Backtracking approach with MRV heuristic and Forward Checking provides an efficient and complete solver.</w:t>
       </w:r>
     </w:p>
@@ -6820,6 +7294,17 @@
     <w:p>
       <w:pPr>
         <w:pStyle w:val="ListParagraph"/>
+        <w:ind w:left="1845"/>
+        <w:jc w:val="both"/>
+        <w:rPr>
+          <w:rFonts w:ascii="Arial" w:hAnsi="Arial" w:cs="Arial"/>
+          <w:szCs w:val="24"/>
+        </w:rPr>
+      </w:pPr>
+    </w:p>
+    <w:p>
+      <w:pPr>
+        <w:pStyle w:val="ListParagraph"/>
         <w:numPr>
           <w:ilvl w:val="1"/>
           <w:numId w:val="1"/>
@@ -6839,6 +7324,7 @@
           <w:bCs/>
           <w:szCs w:val="24"/>
         </w:rPr>
+        <w:lastRenderedPageBreak/>
         <w:t>Key Takeaways</w:t>
       </w:r>
     </w:p>
@@ -6949,7 +7435,23 @@
           <w:rFonts w:ascii="Arial" w:hAnsi="Arial" w:cs="Arial"/>
           <w:szCs w:val="24"/>
         </w:rPr>
-        <w:t>The algorithm is complete — guaranteed to find a solution if one exists, or correctly report failure.</w:t>
+        <w:t xml:space="preserve">The algorithm is complete — guaranteed to find a solution if one </w:t>
+      </w:r>
+      <w:proofErr w:type="gramStart"/>
+      <w:r>
+        <w:rPr>
+          <w:rFonts w:ascii="Arial" w:hAnsi="Arial" w:cs="Arial"/>
+          <w:szCs w:val="24"/>
+        </w:rPr>
+        <w:t>exists, or</w:t>
+      </w:r>
+      <w:proofErr w:type="gramEnd"/>
+      <w:r>
+        <w:rPr>
+          <w:rFonts w:ascii="Arial" w:hAnsi="Arial" w:cs="Arial"/>
+          <w:szCs w:val="24"/>
+        </w:rPr>
+        <w:t xml:space="preserve"> correctly report failure.</w:t>
       </w:r>
     </w:p>
     <w:p>
@@ -7028,12 +7530,16 @@
               <w:jc w:val="center"/>
               <w:rPr>
                 <w:rFonts w:ascii="Arial" w:hAnsi="Arial" w:cs="Arial"/>
-                <w:szCs w:val="24"/>
-              </w:rPr>
-            </w:pPr>
-            <w:r>
-              <w:rPr>
-                <w:rFonts w:ascii="Arial" w:hAnsi="Arial" w:cs="Arial"/>
+                <w:b/>
+                <w:bCs/>
+                <w:szCs w:val="24"/>
+              </w:rPr>
+            </w:pPr>
+            <w:r>
+              <w:rPr>
+                <w:rFonts w:ascii="Arial" w:hAnsi="Arial" w:cs="Arial"/>
+                <w:b/>
+                <w:bCs/>
                 <w:szCs w:val="24"/>
               </w:rPr>
               <w:t>Improvement</w:t>
@@ -7052,12 +7558,16 @@
               <w:jc w:val="center"/>
               <w:rPr>
                 <w:rFonts w:ascii="Arial" w:hAnsi="Arial" w:cs="Arial"/>
-                <w:szCs w:val="24"/>
-              </w:rPr>
-            </w:pPr>
-            <w:r>
-              <w:rPr>
-                <w:rFonts w:ascii="Arial" w:hAnsi="Arial" w:cs="Arial"/>
+                <w:b/>
+                <w:bCs/>
+                <w:szCs w:val="24"/>
+              </w:rPr>
+            </w:pPr>
+            <w:r>
+              <w:rPr>
+                <w:rFonts w:ascii="Arial" w:hAnsi="Arial" w:cs="Arial"/>
+                <w:b/>
+                <w:bCs/>
                 <w:szCs w:val="24"/>
               </w:rPr>
               <w:t>Expected Benefit</w:t>
@@ -7334,6 +7844,505 @@
     </w:p>
     <w:p>
       <w:pPr>
+        <w:pStyle w:val="ListParagraph"/>
+        <w:numPr>
+          <w:ilvl w:val="0"/>
+          <w:numId w:val="1"/>
+        </w:numPr>
+        <w:jc w:val="both"/>
+        <w:rPr>
+          <w:rFonts w:ascii="Arial" w:hAnsi="Arial" w:cs="Arial"/>
+          <w:b/>
+          <w:bCs/>
+          <w:sz w:val="28"/>
+          <w:szCs w:val="28"/>
+        </w:rPr>
+      </w:pPr>
+      <w:r>
+        <w:rPr>
+          <w:rFonts w:ascii="Arial" w:hAnsi="Arial" w:cs="Arial"/>
+          <w:b/>
+          <w:bCs/>
+          <w:sz w:val="28"/>
+          <w:szCs w:val="28"/>
+        </w:rPr>
+        <w:t>Personal Reflection</w:t>
+      </w:r>
+    </w:p>
+    <w:p>
+      <w:pPr>
+        <w:pStyle w:val="ListParagraph"/>
+        <w:jc w:val="both"/>
+        <w:rPr>
+          <w:rFonts w:ascii="Arial" w:hAnsi="Arial" w:cs="Arial"/>
+          <w:szCs w:val="24"/>
+        </w:rPr>
+      </w:pPr>
+      <w:r>
+        <w:rPr>
+          <w:rFonts w:ascii="Arial" w:hAnsi="Arial" w:cs="Arial"/>
+          <w:szCs w:val="24"/>
+        </w:rPr>
+        <w:t>This assignment was both challenging and rewarding. I particularly enjoyed modeling Sudoku as a formal CSP and seeing how classical AI techniques — AC-3 and Backtracking Search — come together to solve puzzles that would be tedious to tackle by hand. Building the interactive GUI with real-time visualization was one of the most engaging parts, as it allowed me to observe the algorithms in action: watching the solver prune domains, make guesses, and backtrack in real time gave me a much deeper intuition for how constraint propagation and search interact. The most difficult aspect was implementing the Forward Checking with recursive propagation correctly — ensuring that domain changes are properly undone on backtrack required careful handling of deep copies and state restoration. Debugging subtle off-by-one errors in domain manipulation was also time-consuming. Overall, this assignment strengthened my understanding of CSPs, heuristic search, and the importance of preprocessing (AC-3) in reducing computational effort.</w:t>
+      </w:r>
+    </w:p>
+    <w:p>
+      <w:pPr>
+        <w:pStyle w:val="ListParagraph"/>
+        <w:jc w:val="both"/>
+        <w:rPr>
+          <w:rFonts w:ascii="Arial" w:hAnsi="Arial" w:cs="Arial"/>
+          <w:b/>
+          <w:bCs/>
+          <w:szCs w:val="24"/>
+        </w:rPr>
+      </w:pPr>
+    </w:p>
+    <w:p>
+      <w:pPr>
+        <w:pStyle w:val="ListParagraph"/>
+        <w:jc w:val="both"/>
+        <w:rPr>
+          <w:rFonts w:ascii="Arial" w:hAnsi="Arial" w:cs="Arial"/>
+          <w:b/>
+          <w:bCs/>
+          <w:szCs w:val="24"/>
+        </w:rPr>
+      </w:pPr>
+    </w:p>
+    <w:p>
+      <w:pPr>
+        <w:pStyle w:val="ListParagraph"/>
+        <w:numPr>
+          <w:ilvl w:val="0"/>
+          <w:numId w:val="1"/>
+        </w:numPr>
+        <w:jc w:val="both"/>
+        <w:rPr>
+          <w:rFonts w:ascii="Arial" w:hAnsi="Arial" w:cs="Arial"/>
+          <w:b/>
+          <w:bCs/>
+          <w:sz w:val="28"/>
+          <w:szCs w:val="28"/>
+        </w:rPr>
+      </w:pPr>
+      <w:r>
+        <w:rPr>
+          <w:rFonts w:ascii="Arial" w:hAnsi="Arial" w:cs="Arial"/>
+          <w:b/>
+          <w:bCs/>
+          <w:sz w:val="28"/>
+          <w:szCs w:val="28"/>
+        </w:rPr>
+        <w:lastRenderedPageBreak/>
+        <w:t>Time Estimation</w:t>
+      </w:r>
+    </w:p>
+    <w:p>
+      <w:pPr>
+        <w:pStyle w:val="ListParagraph"/>
+        <w:jc w:val="both"/>
+        <w:rPr>
+          <w:rFonts w:ascii="Arial" w:hAnsi="Arial" w:cs="Arial"/>
+          <w:szCs w:val="24"/>
+        </w:rPr>
+      </w:pPr>
+    </w:p>
+    <w:tbl>
+      <w:tblPr>
+        <w:tblStyle w:val="TableGrid"/>
+        <w:tblW w:w="0" w:type="auto"/>
+        <w:tblInd w:w="720" w:type="dxa"/>
+        <w:tblLook w:val="04A0" w:firstRow="1" w:lastRow="0" w:firstColumn="1" w:lastColumn="0" w:noHBand="0" w:noVBand="1"/>
+      </w:tblPr>
+      <w:tblGrid>
+        <w:gridCol w:w="8064"/>
+        <w:gridCol w:w="1695"/>
+      </w:tblGrid>
+      <w:tr>
+        <w:trPr>
+          <w:trHeight w:val="397"/>
+        </w:trPr>
+        <w:tc>
+          <w:tcPr>
+            <w:tcW w:w="8064" w:type="dxa"/>
+            <w:vAlign w:val="center"/>
+          </w:tcPr>
+          <w:p>
+            <w:pPr>
+              <w:pStyle w:val="ListParagraph"/>
+              <w:ind w:left="0"/>
+              <w:jc w:val="center"/>
+              <w:rPr>
+                <w:rFonts w:ascii="Arial" w:hAnsi="Arial" w:cs="Arial"/>
+                <w:b/>
+                <w:bCs/>
+                <w:szCs w:val="24"/>
+              </w:rPr>
+            </w:pPr>
+            <w:r>
+              <w:rPr>
+                <w:rFonts w:ascii="Arial" w:hAnsi="Arial" w:cs="Arial"/>
+                <w:b/>
+                <w:bCs/>
+                <w:szCs w:val="24"/>
+              </w:rPr>
+              <w:t>Phase</w:t>
+            </w:r>
+          </w:p>
+        </w:tc>
+        <w:tc>
+          <w:tcPr>
+            <w:tcW w:w="1695" w:type="dxa"/>
+            <w:vAlign w:val="center"/>
+          </w:tcPr>
+          <w:p>
+            <w:pPr>
+              <w:pStyle w:val="ListParagraph"/>
+              <w:ind w:left="0"/>
+              <w:jc w:val="center"/>
+              <w:rPr>
+                <w:rFonts w:ascii="Arial" w:hAnsi="Arial" w:cs="Arial"/>
+                <w:b/>
+                <w:bCs/>
+                <w:szCs w:val="24"/>
+              </w:rPr>
+            </w:pPr>
+            <w:r>
+              <w:rPr>
+                <w:rFonts w:ascii="Arial" w:hAnsi="Arial" w:cs="Arial"/>
+                <w:b/>
+                <w:bCs/>
+                <w:szCs w:val="24"/>
+              </w:rPr>
+              <w:t>Time</w:t>
+            </w:r>
+          </w:p>
+        </w:tc>
+      </w:tr>
+      <w:tr>
+        <w:trPr>
+          <w:trHeight w:val="397"/>
+        </w:trPr>
+        <w:tc>
+          <w:tcPr>
+            <w:tcW w:w="8064" w:type="dxa"/>
+            <w:vAlign w:val="center"/>
+          </w:tcPr>
+          <w:p>
+            <w:pPr>
+              <w:pStyle w:val="ListParagraph"/>
+              <w:ind w:left="0"/>
+              <w:rPr>
+                <w:rFonts w:ascii="Arial" w:hAnsi="Arial" w:cs="Arial"/>
+                <w:szCs w:val="24"/>
+              </w:rPr>
+            </w:pPr>
+            <w:r>
+              <w:rPr>
+                <w:rFonts w:ascii="Arial" w:hAnsi="Arial" w:cs="Arial"/>
+                <w:szCs w:val="24"/>
+              </w:rPr>
+              <w:t>Understanding the CSP formulation and algorithms</w:t>
+            </w:r>
+          </w:p>
+        </w:tc>
+        <w:tc>
+          <w:tcPr>
+            <w:tcW w:w="1695" w:type="dxa"/>
+            <w:vAlign w:val="center"/>
+          </w:tcPr>
+          <w:p>
+            <w:pPr>
+              <w:pStyle w:val="ListParagraph"/>
+              <w:ind w:left="0"/>
+              <w:rPr>
+                <w:rFonts w:ascii="Arial" w:hAnsi="Arial" w:cs="Arial"/>
+                <w:szCs w:val="24"/>
+              </w:rPr>
+            </w:pPr>
+            <w:r>
+              <w:rPr>
+                <w:rFonts w:ascii="Arial" w:hAnsi="Arial" w:cs="Arial"/>
+                <w:szCs w:val="24"/>
+              </w:rPr>
+              <w:t>0.5 hour</w:t>
+            </w:r>
+          </w:p>
+        </w:tc>
+      </w:tr>
+      <w:tr>
+        <w:trPr>
+          <w:trHeight w:val="397"/>
+        </w:trPr>
+        <w:tc>
+          <w:tcPr>
+            <w:tcW w:w="8064" w:type="dxa"/>
+            <w:vAlign w:val="center"/>
+          </w:tcPr>
+          <w:p>
+            <w:pPr>
+              <w:pStyle w:val="ListParagraph"/>
+              <w:ind w:left="0"/>
+              <w:rPr>
+                <w:rFonts w:ascii="Arial" w:hAnsi="Arial" w:cs="Arial"/>
+                <w:szCs w:val="24"/>
+              </w:rPr>
+            </w:pPr>
+            <w:r>
+              <w:rPr>
+                <w:rFonts w:ascii="Arial" w:hAnsi="Arial" w:cs="Arial"/>
+                <w:szCs w:val="24"/>
+              </w:rPr>
+              <w:t>Implementing core solver (AC-3, Backtracking, MRV, Forward Checking)</w:t>
+            </w:r>
+          </w:p>
+        </w:tc>
+        <w:tc>
+          <w:tcPr>
+            <w:tcW w:w="1695" w:type="dxa"/>
+            <w:vAlign w:val="center"/>
+          </w:tcPr>
+          <w:p>
+            <w:pPr>
+              <w:pStyle w:val="ListParagraph"/>
+              <w:ind w:left="0"/>
+              <w:rPr>
+                <w:rFonts w:ascii="Arial" w:hAnsi="Arial" w:cs="Arial"/>
+                <w:szCs w:val="24"/>
+              </w:rPr>
+            </w:pPr>
+            <w:r>
+              <w:rPr>
+                <w:rFonts w:ascii="Arial" w:hAnsi="Arial" w:cs="Arial"/>
+                <w:szCs w:val="24"/>
+              </w:rPr>
+              <w:t>1.5 hours</w:t>
+            </w:r>
+          </w:p>
+        </w:tc>
+      </w:tr>
+      <w:tr>
+        <w:trPr>
+          <w:trHeight w:val="397"/>
+        </w:trPr>
+        <w:tc>
+          <w:tcPr>
+            <w:tcW w:w="8064" w:type="dxa"/>
+            <w:vAlign w:val="center"/>
+          </w:tcPr>
+          <w:p>
+            <w:pPr>
+              <w:pStyle w:val="ListParagraph"/>
+              <w:ind w:left="0"/>
+              <w:rPr>
+                <w:rFonts w:ascii="Arial" w:hAnsi="Arial" w:cs="Arial"/>
+                <w:szCs w:val="24"/>
+              </w:rPr>
+            </w:pPr>
+            <w:r>
+              <w:rPr>
+                <w:rFonts w:ascii="Arial" w:hAnsi="Arial" w:cs="Arial"/>
+                <w:szCs w:val="24"/>
+              </w:rPr>
+              <w:t>Building the interactive GUI with Pygame</w:t>
+            </w:r>
+          </w:p>
+        </w:tc>
+        <w:tc>
+          <w:tcPr>
+            <w:tcW w:w="1695" w:type="dxa"/>
+            <w:vAlign w:val="center"/>
+          </w:tcPr>
+          <w:p>
+            <w:pPr>
+              <w:pStyle w:val="ListParagraph"/>
+              <w:ind w:left="0"/>
+              <w:rPr>
+                <w:rFonts w:ascii="Arial" w:hAnsi="Arial" w:cs="Arial"/>
+                <w:szCs w:val="24"/>
+              </w:rPr>
+            </w:pPr>
+            <w:r>
+              <w:rPr>
+                <w:rFonts w:ascii="Arial" w:hAnsi="Arial" w:cs="Arial"/>
+                <w:szCs w:val="24"/>
+              </w:rPr>
+              <w:t>1 hour</w:t>
+            </w:r>
+          </w:p>
+        </w:tc>
+      </w:tr>
+      <w:tr>
+        <w:trPr>
+          <w:trHeight w:val="397"/>
+        </w:trPr>
+        <w:tc>
+          <w:tcPr>
+            <w:tcW w:w="8064" w:type="dxa"/>
+            <w:vAlign w:val="center"/>
+          </w:tcPr>
+          <w:p>
+            <w:pPr>
+              <w:pStyle w:val="ListParagraph"/>
+              <w:ind w:left="0"/>
+              <w:rPr>
+                <w:rFonts w:ascii="Arial" w:hAnsi="Arial" w:cs="Arial"/>
+                <w:szCs w:val="24"/>
+              </w:rPr>
+            </w:pPr>
+            <w:r>
+              <w:rPr>
+                <w:rFonts w:ascii="Arial" w:hAnsi="Arial" w:cs="Arial"/>
+                <w:szCs w:val="24"/>
+              </w:rPr>
+              <w:t>Testing, debugging, and benchmarking</w:t>
+            </w:r>
+          </w:p>
+        </w:tc>
+        <w:tc>
+          <w:tcPr>
+            <w:tcW w:w="1695" w:type="dxa"/>
+            <w:vAlign w:val="center"/>
+          </w:tcPr>
+          <w:p>
+            <w:pPr>
+              <w:pStyle w:val="ListParagraph"/>
+              <w:ind w:left="0"/>
+              <w:rPr>
+                <w:rFonts w:ascii="Arial" w:hAnsi="Arial" w:cs="Arial"/>
+                <w:szCs w:val="24"/>
+              </w:rPr>
+            </w:pPr>
+            <w:r>
+              <w:rPr>
+                <w:rFonts w:ascii="Arial" w:hAnsi="Arial" w:cs="Arial"/>
+                <w:szCs w:val="24"/>
+              </w:rPr>
+              <w:t>1 hour</w:t>
+            </w:r>
+          </w:p>
+        </w:tc>
+      </w:tr>
+      <w:tr>
+        <w:trPr>
+          <w:trHeight w:val="397"/>
+        </w:trPr>
+        <w:tc>
+          <w:tcPr>
+            <w:tcW w:w="8064" w:type="dxa"/>
+            <w:vAlign w:val="center"/>
+          </w:tcPr>
+          <w:p>
+            <w:pPr>
+              <w:pStyle w:val="ListParagraph"/>
+              <w:ind w:left="0"/>
+              <w:rPr>
+                <w:rFonts w:ascii="Arial" w:hAnsi="Arial" w:cs="Arial"/>
+                <w:szCs w:val="24"/>
+              </w:rPr>
+            </w:pPr>
+            <w:r>
+              <w:rPr>
+                <w:rFonts w:ascii="Arial" w:hAnsi="Arial" w:cs="Arial"/>
+                <w:szCs w:val="24"/>
+              </w:rPr>
+              <w:t>Writing the report and analysis</w:t>
+            </w:r>
+          </w:p>
+        </w:tc>
+        <w:tc>
+          <w:tcPr>
+            <w:tcW w:w="1695" w:type="dxa"/>
+            <w:vAlign w:val="center"/>
+          </w:tcPr>
+          <w:p>
+            <w:pPr>
+              <w:pStyle w:val="ListParagraph"/>
+              <w:ind w:left="0"/>
+              <w:rPr>
+                <w:rFonts w:ascii="Arial" w:hAnsi="Arial" w:cs="Arial"/>
+                <w:szCs w:val="24"/>
+              </w:rPr>
+            </w:pPr>
+            <w:r>
+              <w:rPr>
+                <w:rFonts w:ascii="Arial" w:hAnsi="Arial" w:cs="Arial"/>
+                <w:szCs w:val="24"/>
+              </w:rPr>
+              <w:t>1 hour</w:t>
+            </w:r>
+          </w:p>
+        </w:tc>
+      </w:tr>
+      <w:tr>
+        <w:trPr>
+          <w:trHeight w:val="397"/>
+        </w:trPr>
+        <w:tc>
+          <w:tcPr>
+            <w:tcW w:w="8064" w:type="dxa"/>
+            <w:vAlign w:val="center"/>
+          </w:tcPr>
+          <w:p>
+            <w:pPr>
+              <w:pStyle w:val="ListParagraph"/>
+              <w:ind w:left="0"/>
+              <w:rPr>
+                <w:rFonts w:ascii="Arial" w:hAnsi="Arial" w:cs="Arial"/>
+                <w:b/>
+                <w:bCs/>
+                <w:szCs w:val="24"/>
+              </w:rPr>
+            </w:pPr>
+            <w:r>
+              <w:rPr>
+                <w:rFonts w:ascii="Arial" w:hAnsi="Arial" w:cs="Arial"/>
+                <w:b/>
+                <w:bCs/>
+                <w:szCs w:val="24"/>
+              </w:rPr>
+              <w:t>Total</w:t>
+            </w:r>
+          </w:p>
+        </w:tc>
+        <w:tc>
+          <w:tcPr>
+            <w:tcW w:w="1695" w:type="dxa"/>
+            <w:vAlign w:val="center"/>
+          </w:tcPr>
+          <w:p>
+            <w:pPr>
+              <w:pStyle w:val="ListParagraph"/>
+              <w:ind w:left="0"/>
+              <w:rPr>
+                <w:rFonts w:ascii="Arial" w:hAnsi="Arial" w:cs="Arial"/>
+                <w:szCs w:val="24"/>
+              </w:rPr>
+            </w:pPr>
+            <w:r>
+              <w:rPr>
+                <w:rFonts w:ascii="Arial" w:hAnsi="Arial" w:cs="Arial"/>
+                <w:szCs w:val="24"/>
+              </w:rPr>
+              <w:t>5 hours</w:t>
+            </w:r>
+          </w:p>
+        </w:tc>
+      </w:tr>
+    </w:tbl>
+    <w:p>
+      <w:pPr>
+        <w:pStyle w:val="ListParagraph"/>
+        <w:jc w:val="both"/>
+        <w:rPr>
+          <w:rFonts w:ascii="Arial" w:hAnsi="Arial" w:cs="Arial"/>
+          <w:szCs w:val="24"/>
+        </w:rPr>
+      </w:pPr>
+    </w:p>
+    <w:p>
+      <w:pPr>
         <w:ind w:left="426"/>
         <w:jc w:val="both"/>
         <w:rPr>
@@ -7488,7 +8497,6 @@
           <w:sz w:val="23"/>
           <w:szCs w:val="23"/>
         </w:rPr>
-        <w:lastRenderedPageBreak/>
         <w:t># Interactive GUI</w:t>
       </w:r>
       <w:r>
@@ -11490,6 +12498,7 @@
   <w:style w:type="character" w:default="1" w:styleId="DefaultParagraphFont">
     <w:name w:val="Default Paragraph Font"/>
     <w:uiPriority w:val="1"/>
+    <w:semiHidden/>
     <w:unhideWhenUsed/>
   </w:style>
   <w:style w:type="table" w:default="1" w:styleId="TableNormal">

</xml_diff>